<commit_message>
Plan Sushi Bar ES · F2 cerrada: los 4 entregables regenerados tras la revisión (gates verdes) y F2-NOTAS
Via: Claude Code
Co-Authored-By: Claude Opus 5.5 <noreply@anthropic.com>
</commit_message>
<xml_diff>
--- a/astro-site/public/dl/plan-negocio-sushi-bar/plan-de-negocio-sushi-bar.docx
+++ b/astro-site/public/dl/plan-negocio-sushi-bar/plan-de-negocio-sushi-bar.docx
@@ -330,12 +330,12 @@
     </w:p>
     <w:p>
       <w:r>
-        <w:t>A partir de ahí, los comensales crecen un 6 % en el segundo año y un 4 % en el tercero, con el mismo ticket: las ventas pasan a 502.440 € y 522.538 €, y el neto, a 52.106 € y 51.086 €. La holgura de caja sobre el equilibrio es de 27,8 % el primer año, pero porque hay carencia. En el segundo baja a 21,5 %, porque empieza a devolverse el principal, y en el tercero es de 23,3 %. Son los años que hay que vigilar. El payback antes de la deuda, en años, sale en la Tesorería del Excel: «2,5» con el fondo de maniobra dentro y «1,7» sin él.</w:t>
+        <w:t>A partir de ahí, los comensales crecen un 6 % en el segundo año y un 4 % en el tercero, con el mismo ticket: las ventas pasan a 502.440 € y 522.538 €, y el neto, a 52.106 € y 51.086 €. La holgura de caja sobre el equilibrio es del 27,8 % el primer año, pero porque hay carencia. En el segundo baja al 21,5 %, porque empieza a devolverse el principal, y en el tercero es del 23,3 %. Son los años que hay que vigilar. El payback antes de la deuda, en años, sale en la Tesorería del Excel: «2,5» con el fondo de maniobra dentro y «1,7» sin él.</w:t>
       </w:r>
     </w:p>
     <w:p>
       <w:r>
-        <w:t>El equipo es corto y se apoya en ti: eres el itamae y el gerente; te acompañan un sushiman, un cocinero de cocina caliente y arroz, sala y pedidos, y un refuerzo de fin de semana, en 7 personas que suman 5,35 jornadas completas. El kit incluye este plan de diez secciones, el Excel de nueve hojas, el checklist de 80 tareas, la calculadora del pescado y la guía de equivalencias para Latinoamérica. Lo que lo distingue: 121 nigiris por kilo de arroz crudo y el kilo útil de salmón entero a 14,29 € (estimaciones del kit que mides tú), y la norma contada bien: anisakis (art. 8 del RD 1021/2022) y shari, el arroz de sushi aliñado (art. 30.5 del RD 1086/2020).</w:t>
+        <w:t>Tú eres el itamae y el gerente, y te acompañan un sushiman, un cocinero de cocina caliente y arroz, un encargado de sala y pedidos, un camarero de cenas y un refuerzo de fin de semana: con las suplencias, 7 personas que suman 5,35 jornadas completas. El kit incluye este plan de diez secciones, el Excel de nueve hojas, el checklist de 80 tareas, la calculadora del pescado y la guía de equivalencias para Latinoamérica. Lo que lo distingue: 121 nigiris por kilo de arroz crudo y el kilo útil de salmón entero a 14,29 € (estimaciones del kit que mides tú), y la norma contada bien: anisakis (art. 8 del RD 1021/2022) y shari, el arroz de sushi aliñado (art. 30.5 del RD 1086/2020).</w:t>
       </w:r>
     </w:p>
     <w:p>
@@ -357,22 +357,22 @@
     </w:p>
     <w:p>
       <w:r>
-        <w:t>No todos los sushi bar son el mismo negocio. El de solo para llevar y a domicilio ocupa de 40 a 60 m², con 0-6 plazas: la franquicia de quiosco más barata pide 39.950 € más la obra, según emprendedores.es, y si los pedidos son la actividad principal el IAE es el 677.9. El de barrio, con barra y mesas, para llevar y a domicilio, es el de este plan. La barra omakase de 10-12 plazas, con reserva, tiene un ticket de 80-150 € según la Guía Restaurante Japonés de AI Chef Pro: otro negocio y otro pescado. El kaiten, la cinta giratoria, y el buffet libre piden 80-120 plazas a precio cerrado. El nikkei tiene su Guía Restaurante Nikkei, y el japonés completo, con ramen, izakaya o robata, la Guía Restaurante Japonés.</w:t>
+        <w:t>No todos los sushi bar son el mismo negocio. El de solo para llevar y a domicilio ocupa de 40 a 60 m², con 0-6 plazas: una franquicia de quiosco como Sushimore pide 39.950 € más la obra, según emprendedores.es, y si los pedidos son la actividad principal el IAE es el 677.9. El de barrio, con barra y mesas, para llevar y a domicilio, es el de este plan. La barra omakase (el menú que decide el itamae) de 10-12 plazas, con reserva, tiene un ticket a partir de 80 € según la Guía Restaurante Japonés de AI Chef Pro: otro negocio y otro pescado. El kaiten, la cinta giratoria, y el buffet libre piden 80-120 plazas a precio cerrado. El nikkei tiene su Guía Restaurante Nikkei, y el japonés completo, con ramen, izakaya o robata, la Guía Restaurante Japonés.</w:t>
       </w:r>
     </w:p>
     <w:p>
       <w:r>
-        <w:t>La propuesta de valor es el itamae a la vista, con una carta corta que no llena la vitrina de neta, es decir, la vitrina refrigerada donde se expone el pescado o el marisco cortado que va sobre el arroz, de modo que no se tira. En la barra, el sushiman (o sushiwoman) monta las piezas. El shari es el arroz de sushi ya aliñado con sushi-zu, el aliño de vinagre de arroz, azúcar y sal, que se mezcla y se enfría en un hangiri, la tina de madera, y se mide y se hace en el día. El pescado llega en saku, el bloque limpio listo para cortar, con su documento o congelado como manda la norma. La carta tiene nigiri (shari con una loncha de neta encima), sashimi (el pescado cortado, sin arroz), hosomaki (rollo fino con el alga por fuera), uramaki (rollo con el arroz por fuera), temaki (cono de alga) y el combinado, la bandeja de piezas variadas que más sale para llevar. Un menú del día llena la sala a mediodía.</w:t>
+        <w:t>La propuesta de valor es el itamae a la vista, con una carta corta que no llena la vitrina de neta (la vitrina refrigerada del pescado o el marisco cortado que va sobre el arroz), de modo que no se tira. En la barra, el sushiman (o sushiwoman) monta las piezas. El shari es el arroz de sushi ya aliñado con sushi-zu, el aliño de vinagre de arroz, azúcar y sal, que se mezcla y se enfría en un hangiri, la tina de madera, y se mide y se hace en el día. El salmón llega entero y se limpia en casa; el atún, en saku, el bloque limpio listo para cortar; y todo, con su documento o congelado como manda la norma. La carta tiene nigiri (shari con una loncha de neta encima), sashimi (el pescado cortado, sin arroz), hosomaki (rollo fino con el alga por fuera), uramaki (rollo con el arroz por fuera), temaki (cono de alga) y el combinado, la bandeja de piezas variadas que más sale para llevar. Un menú del día llena la sala a mediodía.</w:t>
       </w:r>
     </w:p>
     <w:p>
       <w:r>
-        <w:t>La carta del caso, con IVA, tiene el nigiri de salmón a 5,20 € las dos piezas, el uramaki California a 9,60 € los ocho, el sashimi de salmón a 7,50 €, el poke de salmón (un bol de arroz con pescado crudo marinado y verduras) a 12,90 €, el combinado de 24 piezas a 29,00 € y las gyozas a 7,00 €, más un menú del día de martes a viernes a 14,90 €. El nigiri de salmón sale en 11,3 % de food cost sobre sus 4,73 € sin IVA: una estimación del kit que mides tú.</w:t>
+        <w:t>La carta del caso, con IVA, tiene el nigiri de salmón a 5,20 € las dos piezas, el uramaki California a 9,60 € los ocho, el sashimi de salmón a 7,50 €, el poke de salmón (un bol de arroz con pescado crudo marinado y verduras) a 12,90 €, el combinado de 24 piezas a 29,00 € y las gyozas a 7,00 €, más un menú del día de martes a viernes a 14,90 €. El nigiri de salmón sale en un 11,3 % de food cost (el coste de su materia prima) sobre sus 4,73 € sin IVA: una estimación del kit que mides tú.</w:t>
       </w:r>
     </w:p>
     <w:p>
       <w:r>
-        <w:t>El ticket del caso es de 20,00 € por comensal equivalente y sin IVA, es decir, 22,02 € con IVA, y sale de tres canales. El comensal de sala deja unos 22,26 € sin IVA: el menú del día es un 30 % de la sala, y la cena o el fin de semana rondan los 28,60 € con IVA con la bebida. El pedido para recoger, un combinado de 24 piezas y un extra de unos 27,00 € con IVA, sale a unos 15,34 € por comensal equivalente; y el de plataforma, con el precio un 15 % más alto, a unos 18,47 €. La mezcla de ventas es de 85 % de comida y 15 % de bebida: en sala, la bebida es un 22 % de lo que se vende; fuera, un 4 %.</w:t>
+        <w:t>El ticket del caso es de 20,00 € por comensal equivalente y sin IVA, es decir, 22,02 € con IVA, y sale de tres canales. El comensal de sala deja unos 22,26 € sin IVA: el menú del día es un 30 % de la sala, y la cena o el fin de semana rondan los 28,60 € con IVA y con la bebida. El pedido para recoger, de unos 27,00 € con IVA de media (un combinado y algún extra), sale a unos 15,34 € por comensal equivalente; y el de plataforma, con la carta un 15 % más cara y un pedido algo mayor, a unos 18,47 €. La mezcla de ventas es de un 85 % de comida y un 15 % de bebida: en sala, la bebida es un 22 % de lo que se vende; fuera, un 4 %.</w:t>
       </w:r>
     </w:p>
     <w:p>
@@ -414,12 +414,12 @@
     </w:p>
     <w:p>
       <w:r>
-        <w:t>Con el Mes 1 en enero y en el orden del calendario, el plan reparte la venta con la estacionalidad. Diciembre es el pico, con un 9,2 % del año y las bandejas de Nochebuena y Nochevieja; febrero sube con San Valentín, con un 8,6 %; y agosto es el valle, con un 6,6 %, por el cierre de 10 días y la ciudad vacía. Entre el mejor mes y el peor hay un 39 % de diferencia. En la costa, agosto sube: gira la fila de la Tesorería. El Mes 1 en enero tiene su consecuencia: la rampa del arranque va de enero a abril, y el saldo mínimo de caja cae en enero, con 68.304 €, por eso el fondo de maniobra cuenta.</w:t>
+        <w:t>Con el Mes 1 en enero y en el orden del calendario, el plan reparte la venta con la estacionalidad. Diciembre es el pico, con un 9,2 % del año y las bandejas de Nochebuena y Nochevieja; febrero sube con San Valentín, con un 8,6 %; y agosto es el valle, con un 6,6 %, por el cierre de 10 días y la ciudad vacía. Entre el mejor mes y el peor hay un 39 % de diferencia. En la costa, agosto sube: cambia los pesos de la fila de estacionalidad de la Tesorería. El Mes 1 en enero tiene su consecuencia: la rampa del arranque va de enero a abril, y el saldo mínimo de caja cae en enero, con 68.304 €, por eso el fondo de maniobra cuenta.</w:t>
       </w:r>
     </w:p>
     <w:p>
       <w:r>
-        <w:t>El hueco es claro. Para «plan de negocio sushi», la SERP de Google da páginas de modelos con inversiones sin fuente («50.000-160.000 €», «230.000-790.000 $»), franquicias, vídeos y foros. Nadie cuenta el coste de cada pieza, ni que el art. 8.2 del RD 1021/2022 obliga a informar al cliente del anisakis, ni que el shari a temperatura ambiente solo cabe por el art. 30.5 del RD 1086/2020.</w:t>
+        <w:t>El hueco es claro. Para «montar restaurante de sushi», la SERP de Google (la página de resultados) da páginas de modelos con inversiones sin fuente («50.000-160.000 €», «230.000-790.000 $»), franquicias, vídeos y foros. Nadie cuenta el coste de cada pieza, ni que el art. 8.2 del RD 1021/2022 obliga a informar al cliente del anisakis, ni que el shari a temperatura ambiente solo cabe por el art. 30.5 del RD 1086/2020.</w:t>
       </w:r>
     </w:p>
     <w:p>
@@ -471,7 +471,7 @@
     </w:p>
     <w:p>
       <w:r>
-        <w:t>El DAFO de este concepto es claro. Fortalezas: itamae a la vista, pescado limpio en casa, carta corta, combinados con su escandallo por canal y un margen bruto del 58,2 % en el primer año. Debilidades: un local con requisitos de humos, un solo itamae y una caja más ajustada en los años de devolución del préstamo, con una holgura de 21,5 % en el segundo. Oportunidades: un producto que se busca muchísimo, el menú del día y la recogida en el local. Amenazas: el precio del salmón y la plataforma, donde el margen del combinado de 24 cae de 22,16 € en sala a 16,12 €. La defensa está en dos proveedores, el escandallo por canal y un segundo que corte.</w:t>
+        <w:t>El DAFO de este concepto es claro. Fortalezas: itamae a la vista, pescado limpio en casa, carta corta, combinados con su escandallo por canal y un margen bruto del 58,2 % en el primer año. Debilidades: un local con requisitos de humos, un solo itamae y una caja más ajustada en los años de devolución del préstamo, con una holgura del 21,5 % en el segundo. Oportunidades: un producto que se busca muchísimo, el menú del día y la recogida en el local. Amenazas: el precio del salmón y la plataforma, donde el margen del combinado de 24 cae de 22,16 € en sala a 16,12 €. La defensa está en dos proveedores, el escandallo por canal y un segundo que corte.</w:t>
       </w:r>
     </w:p>
     <w:p>
@@ -555,7 +555,7 @@
     </w:p>
     <w:p>
       <w:r>
-        <w:t>El arroz también se mide. Un kilo de arroz crudo da 2,42 kilos de shari, porque al cocerlo se multiplica por 2,2 y se aliña con un 10 % de sushi-zu, y rinde unos 121 nigiris con 20 g de shari cada uno. Con unos 150 g de shari por comensal, el caso cuece unos 4,9 kilos de arroz crudo al día. El arroz sale barato, de 1,81 a 1,85 € el kilo sin IVA en sacos de 5 kg de mayorista: el coste está en el pescado y en la mano del itamae. Por eso, pesa diez lonchas y diez bolas de shari de cada persona de la barra. La neta y el shari que pesan de más son food cost que no sale en el escandallo.</w:t>
+        <w:t>El arroz también se mide. Con los valores del kit, un kilo de arroz crudo da 2,42 kilos de shari, porque al cocerlo se multiplica por 2,2 y se aliña con un 10 % de sushi-zu, y rinde unos 121 nigiris con 20 g de shari cada uno. Con unos 150 g de shari por comensal, el caso cuece unos 4,9 kilos de arroz crudo al día. El arroz sale barato, de 1,81 a 1,85 € el kilo sin IVA en sacos de 5 kg de mayorista: el coste está en el pescado y en la mano del itamae. Por eso, pesa diez lonchas y diez bolas de shari de cada persona de la barra. La neta y el shari que pesan de más son food cost que no sale en el escandallo.</w:t>
       </w:r>
     </w:p>
     <w:p>
@@ -602,7 +602,7 @@
     </w:p>
     <w:p>
       <w:r>
-        <w:t>El itamae es la contratación difícil. Las ofertas de sushiman de los portales de empleo van de 12.000 a 22.000 € brutos al año, muchas a media jornada, y las de un omakase de Ibiza pasan de 2.500 € al mes. Contrátalo antes de la obra y pídele opinión sobre la barra y el frío. Y piensa en el itamae único: es un riesgo, no un ahorro, porque si falta no abre la barra. Una advertencia más: nunca sustituyas plantilla por autónomos que te facturan con tu horario. Eso es falso autónomo (art. 1.1 del Estatuto de los Trabajadores) y una sanción esperando.</w:t>
+        <w:t>El itamae es la contratación difícil. Las ofertas de sushiman de los portales de empleo van de 12.000 a 22.000 € brutos al año, muchas a media jornada, y las de un omakase de Ibiza parten de 2.500 € al mes. Contrátalo antes de la obra y pídele opinión sobre la barra y el frío. Y piensa en el itamae único: es un riesgo, no un ahorro, porque si falta no abre la barra. Una advertencia más: nunca sustituyas plantilla por autónomos que te facturan con tu horario. Eso es falso autónomo (art. 1.1 del Estatuto de los Trabajadores) y una sanción esperando.</w:t>
       </w:r>
     </w:p>
     <w:p>
@@ -634,7 +634,7 @@
     </w:p>
     <w:p>
       <w:r>
-        <w:t>Para abrir necesitas 163.658 €. Son 103.350 € de obra, barra, frío, equipo y puesta en marcha, 3.200 € de fianza y 3.200 € de renta antes de abrir, que suman 109.750 € de compras, más 53.908 € de fondo de maniobra. A eso se suma el IVA de la inversión, 21.746 €, que adelantas y recuperas después, y la necesidad de caja queda en 185.404 €. La financiación son 55.000 € propios y un préstamo de 131.000 € al 6 % a 7 años, con una carencia, en años, de 1 y una cuota anual de 26.641 €.</w:t>
+        <w:t>Para abrir necesitas 163.658 €. Son 103.350 € de obra, barra, frío, equipo y puesta en marcha, 3.200 € de fianza y 3.200 € de renta antes de abrir, que suman 109.750 € de inversión sin el fondo, más 53.908 € de fondo de maniobra. A eso se suma el IVA de la inversión, 21.746 €, que adelantas y recuperas después, y la necesidad de caja queda en 185.404 €. La financiación son 55.000 € propios y un préstamo de 131.000 € al 6 % a 7 años, con una carencia, en años, de 1 y una cuota anual de 26.641 €.</w:t>
       </w:r>
     </w:p>
     <w:p>
@@ -644,7 +644,7 @@
     </w:p>
     <w:p>
       <w:r>
-        <w:t>El crecimiento es el que hace el Excel: suben los comensales un 6 % el segundo año y un 4 % el tercero, de 79 a 84 y 87 al día, con el mismo ticket de 20,00 € sin IVA, y la plantilla crece con personas (6.000 € de incorporaciones al año), no con un porcentaje. En el IVA, la comida va al 10 %. De la bebida, la parte que sale del local con alcohol o con azúcares añadidos (cerveza, sake, vino y refrescos) es el 7,0 % de la bebida, un 1,1 % de las ventas, y va al 21 %; el resto va al 10 % y el IVA medio de la bebida queda en 10,8 %. En las compras, el IVA soportado de la comida es 8,7 %, porque el arroz, la verdura, el aguacate, el huevo y el queso se compran al 4 %, y el de la bebida, 18,3 %.</w:t>
+        <w:t>El crecimiento es el que hace el Excel: suben los comensales un 6 % el segundo año y un 4 % el tercero, de 79 a 84 y 87 al día, con el mismo ticket de 20,00 € sin IVA, y la plantilla crece con personas (6.000 € de incorporaciones al año), no con un porcentaje. En el IVA, la comida va al 10 %. De la bebida, la parte que sale del local con alcohol o con azúcares o edulcorantes añadidos (cerveza, sake, vino y refrescos) es el 7,0 % de la bebida, un 1,1 % de las ventas, y va al 21 %; el resto va al 10 % y el IVA medio de la bebida queda en un 10,8 %. En las compras, el IVA soportado de la comida es del 8,7 %, porque el arroz, la verdura, el aguacate, el huevo y el queso se compran al 4 %, y el de la bebida, del 18,3 %.</w:t>
       </w:r>
     </w:p>
     <w:p>
@@ -659,7 +659,7 @@
     </w:p>
     <w:p>
       <w:r>
-        <w:t>El DSCR mínimo es de 2,52, con 2,60 en el segundo año y 2,52 en el tercero: el negocio cubre la deuda con margen. El payback antes de la deuda, en años, es «2,5» con el fondo de maniobra dentro y «1,7» sin él. No es una recuperación rápida, sino un negocio de oficio. Si los números no salen, la palanca es el precio de la carta, nunca más deuda.</w:t>
+        <w:t>El DSCR mínimo es de 2,52, con 2,60 en el segundo año y 2,52 en el tercero: el negocio cubre la deuda con margen. El payback antes de la deuda, en años, es «2,5» con el fondo de maniobra dentro y «1,7» sin él. La recuperación depende de que la barra rinda cada día: es un negocio de oficio, no una renta. Si los números no salen, la palanca es el precio de la carta, nunca más deuda.</w:t>
       </w:r>
     </w:p>
     <w:p>
@@ -738,7 +738,7 @@
     </w:p>
     <w:p>
       <w:r>
-        <w:t>La conclusión es que un sushi bar de barrio de este tamaño es viable, pero exigente. Con 79 comensales equivalentes al día a 20,00 € por comensal, sin IVA, el primer año deja un neto de 43.149 € y una holgura de caja del 27,8 %, que es la del año de carencia. Esa holgura baja al 21,5 % en el segundo año y al 23,3 % en el tercero, cuando ya devuelves el principal. El DSCR mínimo es de 2,52, el saldo mínimo de caja es de 68.304 € en enero y el payback antes de la deuda, en años, es «2,5» con el fondo de maniobra dentro. Es un negocio de oficio, no una inversión de recuperación rápida, y no es para ir con el capital justo.</w:t>
+        <w:t>La conclusión es que un sushi bar de barrio de este tamaño es viable, pero exigente. Con 79 comensales equivalentes al día a 20,00 € por comensal, sin IVA, el primer año deja un neto de 43.149 € y una holgura de caja del 27,8 %, que es la del año de carencia. Esa holgura baja al 21,5 % en el segundo año y se queda en el 23,3 % en el tercero, cuando ya devuelves el principal. El DSCR mínimo es de 2,52, el saldo mínimo de caja es de 68.304 € en enero y el payback antes de la deuda, en años, es «2,5» con el fondo de maniobra dentro. Es un negocio de oficio, que se sostiene con la barra llena cada día, y no es para ir con el capital justo.</w:t>
       </w:r>
     </w:p>
     <w:p>
@@ -758,7 +758,7 @@
     </w:p>
     <w:p>
       <w:r>
-        <w:t>El décimo es dejar bandejas cerradas en la vitrina o para recoger sin la etiqueta del art. 5 del RD 126/2015: ingredientes, alérgenos resaltados, peso, fecha y conservación. El undécimo es cobrar al 10 % la cerveza y los refrescos azucarados para llevar: van al 21 %, igual que el sake y el vino. El duodécimo es prometer «sin gluten» con soja de trigo, tempura y freidora compartida: no se promete. Y el decimotercero es copiar las cifras de una franquicia, como los 180 m² y los 300.000 € de una cadena, para un local de 95 m²: sirven para comparar, no para presupuestar tu caso. Casi todos estos errores tienen su tarea en el checklist, puesta en el orden en que conviene hacerla.</w:t>
+        <w:t>El décimo es dejar bandejas cerradas en la vitrina o para recoger sin la etiqueta del art. 5 del RD 126/2015: ingredientes, alérgenos resaltados, peso, fecha y conservación. El undécimo es cobrar al 10 % la cerveza y los refrescos con azúcares o edulcorantes añadidos para llevar: van al 21 %, igual que el sake y el vino. El duodécimo es prometer «sin gluten» con soja de trigo, tempura y freidora compartida: no se promete. Y el decimotercero es copiar las cifras de una franquicia, como los 180 m² y los 300.000 € de una cadena, para un local de 95 m²: sirven para comparar, no para presupuestar tu caso. Casi todos estos errores tienen su tarea en el checklist, puesta en el orden en que conviene hacerla.</w:t>
       </w:r>
     </w:p>
     <w:p>

</xml_diff>